<commit_message>
fix: plantillas DOCX rediseñadas con texto fluido, sin campos para rellenar
</commit_message>
<xml_diff>
--- a/public/plantillas/1_Registro_Cliente_Hoja_Visita.docx
+++ b/public/plantillas/1_Registro_Cliente_Hoja_Visita.docx
@@ -14,7 +14,7 @@
           <w:color w:val="8F7141"/>
           <w:sz w:val="18"/>
         </w:rPr>
-        <w:t>NATIVA PROPERTIES</w:t>
+        <w:t xml:space="preserve">NATIVA PROPERTIES</w:t>
       </w:r>
     </w:p>
     <w:p>
@@ -32,7 +32,7 @@
           <w:color w:val="405C6B"/>
           <w:sz w:val="30"/>
         </w:rPr>
-        <w:t>REGISTRO DE CLIENTE Y HOJA DE VISITA</w:t>
+        <w:t xml:space="preserve">REGISTRO DE CLIENTE Y HOJA DE VISITA</w:t>
       </w:r>
     </w:p>
     <w:p>
@@ -46,7 +46,7 @@
           <w:i/>
           <w:color w:val="555555"/>
         </w:rPr>
-        <w:t>Registro de visita e interés en el inmueble</w:t>
+        <w:t xml:space="preserve">Registro de visita e interés en el inmueble</w:t>
       </w:r>
     </w:p>
     <w:p>
@@ -58,56 +58,7 @@
           <w:rFonts w:ascii="Garamond" w:eastAsia="Garamond" w:hAnsi="Garamond" w:cs="Garamond"/>
           <w:color w:val="1A2528"/>
         </w:rPr>
-        <w:t xml:space="preserve">En </w:t>
-      </w:r>
-      <w:r>
-        <w:rPr>
-          <w:rFonts w:ascii="Garamond" w:eastAsia="Garamond" w:hAnsi="Garamond" w:cs="Garamond"/>
-          <w:color w:val="999999"/>
-        </w:rPr>
-        <w:t>{ciudad}</w:t>
-      </w:r>
-      <w:r>
-        <w:rPr>
-          <w:rFonts w:ascii="Garamond" w:eastAsia="Garamond" w:hAnsi="Garamond" w:cs="Garamond"/>
-          <w:color w:val="1A2528"/>
-        </w:rPr>
-        <w:t xml:space="preserve">, a </w:t>
-      </w:r>
-      <w:r>
-        <w:rPr>
-          <w:rFonts w:ascii="Garamond" w:eastAsia="Garamond" w:hAnsi="Garamond" w:cs="Garamond"/>
-          <w:color w:val="999999"/>
-        </w:rPr>
-        <w:t>{dia}</w:t>
-      </w:r>
-      <w:r>
-        <w:rPr>
-          <w:rFonts w:ascii="Garamond" w:eastAsia="Garamond" w:hAnsi="Garamond" w:cs="Garamond"/>
-          <w:color w:val="1A2528"/>
-        </w:rPr>
-        <w:t xml:space="preserve"> de </w:t>
-      </w:r>
-      <w:r>
-        <w:rPr>
-          <w:rFonts w:ascii="Garamond" w:eastAsia="Garamond" w:hAnsi="Garamond" w:cs="Garamond"/>
-          <w:color w:val="999999"/>
-        </w:rPr>
-        <w:t>{mes}</w:t>
-      </w:r>
-      <w:r>
-        <w:rPr>
-          <w:rFonts w:ascii="Garamond" w:eastAsia="Garamond" w:hAnsi="Garamond" w:cs="Garamond"/>
-          <w:color w:val="1A2528"/>
-        </w:rPr>
-        <w:t xml:space="preserve"> de </w:t>
-      </w:r>
-      <w:r>
-        <w:rPr>
-          <w:rFonts w:ascii="Garamond" w:eastAsia="Garamond" w:hAnsi="Garamond" w:cs="Garamond"/>
-          <w:color w:val="999999"/>
-        </w:rPr>
-        <w:t>{anyo}</w:t>
+        <w:t xml:space="preserve">En {ciudad}, a {dia} de {mes} de {anyo}</w:t>
       </w:r>
     </w:p>
     <w:p>
@@ -121,7 +72,7 @@
           <w:color w:val="405C6B"/>
           <w:sz w:val="21"/>
         </w:rPr>
-        <w:t>INMUEBLE VISITADO</w:t>
+        <w:t xml:space="preserve">INMUEBLE VISITADO</w:t>
       </w:r>
     </w:p>
     <w:tbl>
@@ -224,7 +175,7 @@
                 <w:sz w:val="19"/>
                 <w:szCs w:val="19"/>
               </w:rPr>
-              <w:t>Referencia catastral: {ref_catastral}</w:t>
+              <w:t xml:space="preserve">Referencia catastral: {ref_catastral}</w:t>
             </w:r>
           </w:p>
         </w:tc>
@@ -270,7 +221,7 @@
                 <w:sz w:val="19"/>
                 <w:szCs w:val="19"/>
               </w:rPr>
-              <w:t>Referencia Interna: {ref_interna}</w:t>
+              <w:t xml:space="preserve">Referencia Interna: {ref_interna}</w:t>
             </w:r>
           </w:p>
         </w:tc>
@@ -316,7 +267,7 @@
                 <w:sz w:val="19"/>
                 <w:szCs w:val="19"/>
               </w:rPr>
-              <w:t>Precio publicación: {precio_publicacion}</w:t>
+              <w:t xml:space="preserve">Precio publicación: {precio_publicacion}</w:t>
             </w:r>
           </w:p>
         </w:tc>
@@ -354,7 +305,7 @@
           <w:color w:val="405C6B"/>
           <w:sz w:val="21"/>
         </w:rPr>
-        <w:t>DATOS DEL AGENTE</w:t>
+        <w:t xml:space="preserve">DATOS DEL AGENTE</w:t>
       </w:r>
     </w:p>
     <w:p>
@@ -381,7 +332,7 @@
           <w:color w:val="405C6B"/>
           <w:sz w:val="21"/>
         </w:rPr>
-        <w:t>DATOS DEL INTERESADO (COMPRADOR POTENCIAL)</w:t>
+        <w:t xml:space="preserve">DATOS DEL INTERESADO (COMPRADOR POTENCIAL)</w:t>
       </w:r>
     </w:p>
     <w:tbl>
@@ -430,7 +381,7 @@
                 <w:sz w:val="19"/>
                 <w:szCs w:val="19"/>
               </w:rPr>
-              <w:t>Nombre y Apellidos: {nombre_comprador_1}</w:t>
+              <w:t xml:space="preserve">Nombre y Apellidos: {nombre_comprador_2} {nombre_comprador_1}</w:t>
             </w:r>
           </w:p>
         </w:tc>
@@ -476,7 +427,7 @@
                 <w:sz w:val="19"/>
                 <w:szCs w:val="19"/>
               </w:rPr>
-              <w:t>DNI/NIE: {dni_comprador_1}</w:t>
+              <w:t>DNI/NIE: {dni_comprador_2} {dni_comprador_1}</w:t>
             </w:r>
           </w:p>
         </w:tc>
@@ -603,7 +554,7 @@
                 <w:sz w:val="19"/>
                 <w:szCs w:val="19"/>
               </w:rPr>
-              <w:t>Nombre y Apellidos:</w:t>
+              <w:t xml:space="preserve">Nombre y Apellidos:</w:t>
             </w:r>
           </w:p>
         </w:tc>
@@ -687,7 +638,7 @@
           <w:color w:val="405C6B"/>
           <w:sz w:val="21"/>
         </w:rPr>
-        <w:t>DECLARACIÓN DEL INTERESADO</w:t>
+        <w:t xml:space="preserve">DECLARACIÓN DEL INTERESADO</w:t>
       </w:r>
     </w:p>
     <w:p>
@@ -740,9 +691,7 @@
           <w:rFonts w:ascii="Garamond" w:eastAsia="Garamond" w:hAnsi="Garamond" w:cs="Garamond"/>
           <w:color w:val="1A2528"/>
         </w:rPr>
-        <w:t xml:space="preserve">De conformidad con el Reglamento (UE) 2016/679 y la Ley Orgánica 3/2018, se informa de que los datos recogidos serán tratados por Mallorca Nativa, S.L. (Nativa Properties) como responsable del tratamiento, con la finalidad de gestionar el interés del interesado en el inmueble. Podrá ejercer sus derechos de acceso, </w:t>
-        <w:lastRenderedPageBreak/>
-        <w:t>rectificación, cancelación y oposición mediante escrito firmado, junto con copia de su DNI, a info@mallorcanativaproperties.com.</w:t>
+        <w:t xml:space="preserve">De conformidad con el Reglamento (UE) 2016/679 y la Ley Orgánica 3/2018, se informa de que los datos recogidos serán tratados por Mallorca Nativa, S.L. (Nativa Properties) como responsable del tratamiento, con la finalidad de gestionar el interés del interesado en el inmueble. Podrá ejercer sus derechos de acceso, rectificación, cancelación y oposición mediante escrito firmado, junto con copia de su DNI, a info@mallorcanativaproperties.com.</w:t>
       </w:r>
     </w:p>
     <w:p>
@@ -756,7 +705,7 @@
           <w:color w:val="405C6B"/>
           <w:sz w:val="21"/>
         </w:rPr>
-        <w:t>FIRMAS DE CONFORMIDAD</w:t>
+        <w:t xml:space="preserve">FIRMAS DE CONFORMIDAD</w:t>
       </w:r>
     </w:p>
     <w:tbl>
@@ -805,7 +754,7 @@
                 <w:sz w:val="19"/>
                 <w:szCs w:val="19"/>
               </w:rPr>
-              <w:t>Firma del Interesado</w:t>
+              <w:t xml:space="preserve">Firma del Interesado</w:t>
             </w:r>
           </w:p>
         </w:tc>
@@ -833,7 +782,7 @@
                 <w:sz w:val="19"/>
                 <w:szCs w:val="19"/>
               </w:rPr>
-              <w:t>Firma del Agente</w:t>
+              <w:t xml:space="preserve">Firma del Agente</w:t>
             </w:r>
           </w:p>
         </w:tc>

</xml_diff>

<commit_message>
fix: eliminar tablas Word, texto fluido sin celdas vacías, segundo comprador condicional
</commit_message>
<xml_diff>
--- a/public/plantillas/1_Registro_Cliente_Hoja_Visita.docx
+++ b/public/plantillas/1_Registro_Cliente_Hoja_Visita.docx
@@ -75,220 +75,58 @@
         <w:t xml:space="preserve">INMUEBLE VISITADO</w:t>
       </w:r>
     </w:p>
-    <w:tbl>
-      <w:tblPr>
-        <w:tblW w:w="9070" w:type="dxa"/>
-        <w:tblBorders>
-          <w:top w:val="single" w:sz="4" w:space="0" w:color="auto"/>
-          <w:left w:val="single" w:sz="4" w:space="0" w:color="auto"/>
-          <w:bottom w:val="single" w:sz="4" w:space="0" w:color="auto"/>
-          <w:right w:val="single" w:sz="4" w:space="0" w:color="auto"/>
-          <w:insideH w:val="single" w:sz="4" w:space="0" w:color="auto"/>
-          <w:insideV w:val="single" w:sz="4" w:space="0" w:color="auto"/>
-        </w:tblBorders>
-        <w:tblCellMar>
-          <w:left w:w="10" w:type="dxa"/>
-          <w:right w:w="10" w:type="dxa"/>
-        </w:tblCellMar>
-        <w:tblLook w:val="04A0" w:firstRow="1" w:lastRow="0" w:firstColumn="1" w:lastColumn="0" w:noHBand="0" w:noVBand="1"/>
-      </w:tblPr>
-      <w:tblGrid>
-        <w:gridCol w:w="3020"/>
-        <w:gridCol w:w="6050"/>
-      </w:tblGrid>
-      <w:tr>
-        <w:tc>
-          <w:tcPr>
-            <w:tcW w:w="3020" w:type="dxa"/>
-            <w:shd w:val="clear" w:color="auto" w:fill="F2EFEB"/>
-            <w:tcMar>
-              <w:top w:w="100" w:type="dxa"/>
-              <w:left w:w="120" w:type="dxa"/>
-              <w:bottom w:w="100" w:type="dxa"/>
-              <w:right w:w="120" w:type="dxa"/>
-            </w:tcMar>
-          </w:tcPr>
-          <w:p>
-            <w:pPr>
-              <w:spacing w:after="60"/>
-            </w:pPr>
-            <w:r>
-              <w:rPr>
-                <w:rFonts w:ascii="Calibri" w:eastAsia="Calibri" w:hAnsi="Calibri" w:cs="Calibri"/>
-                <w:b/>
-                <w:bCs/>
-                <w:color w:val="1A2528"/>
-                <w:sz w:val="19"/>
-                <w:szCs w:val="19"/>
-              </w:rPr>
-              <w:t>Dirección: {direccion}</w:t>
-            </w:r>
-          </w:p>
-        </w:tc>
-        <w:tc>
-          <w:tcPr>
-            <w:tcW w:w="6050" w:type="dxa"/>
-            <w:tcMar>
-              <w:top w:w="100" w:type="dxa"/>
-              <w:left w:w="120" w:type="dxa"/>
-              <w:bottom w:w="100" w:type="dxa"/>
-              <w:right w:w="120" w:type="dxa"/>
-            </w:tcMar>
-          </w:tcPr>
-          <w:p>
-            <w:pPr>
-              <w:spacing w:after="60"/>
-            </w:pPr>
-          </w:p>
-        </w:tc>
-      </w:tr>
-      <w:tr>
-        <w:tc>
-          <w:tcPr>
-            <w:tcW w:w="3020" w:type="dxa"/>
-            <w:shd w:val="clear" w:color="auto" w:fill="F2EFEB"/>
-            <w:tcMar>
-              <w:top w:w="100" w:type="dxa"/>
-              <w:left w:w="120" w:type="dxa"/>
-              <w:bottom w:w="100" w:type="dxa"/>
-              <w:right w:w="120" w:type="dxa"/>
-            </w:tcMar>
-          </w:tcPr>
-          <w:p>
-            <w:pPr>
-              <w:spacing w:after="60"/>
-              <w:rPr>
-                <w:rFonts w:ascii="Calibri" w:eastAsia="Calibri" w:hAnsi="Calibri" w:cs="Calibri"/>
-                <w:b/>
-                <w:bCs/>
-                <w:color w:val="1A2528"/>
-                <w:sz w:val="19"/>
-                <w:szCs w:val="19"/>
-              </w:rPr>
-            </w:pPr>
-            <w:r>
-              <w:rPr>
-                <w:rFonts w:ascii="Calibri" w:eastAsia="Calibri" w:hAnsi="Calibri" w:cs="Calibri"/>
-                <w:b/>
-                <w:bCs/>
-                <w:color w:val="1A2528"/>
-                <w:sz w:val="19"/>
-                <w:szCs w:val="19"/>
-              </w:rPr>
-              <w:t xml:space="preserve">Referencia catastral: {ref_catastral}</w:t>
-            </w:r>
-          </w:p>
-        </w:tc>
-        <w:tc>
-          <w:tcPr>
-            <w:tcW w:w="6050" w:type="dxa"/>
-            <w:tcMar>
-              <w:top w:w="100" w:type="dxa"/>
-              <w:left w:w="120" w:type="dxa"/>
-              <w:bottom w:w="100" w:type="dxa"/>
-              <w:right w:w="120" w:type="dxa"/>
-            </w:tcMar>
-          </w:tcPr>
-          <w:p>
-            <w:pPr>
-              <w:spacing w:after="60"/>
-            </w:pPr>
-          </w:p>
-        </w:tc>
-      </w:tr>
-      <w:tr>
-        <w:tc>
-          <w:tcPr>
-            <w:tcW w:w="3020" w:type="dxa"/>
-            <w:shd w:val="clear" w:color="auto" w:fill="F2EFEB"/>
-            <w:tcMar>
-              <w:top w:w="100" w:type="dxa"/>
-              <w:left w:w="120" w:type="dxa"/>
-              <w:bottom w:w="100" w:type="dxa"/>
-              <w:right w:w="120" w:type="dxa"/>
-            </w:tcMar>
-          </w:tcPr>
-          <w:p>
-            <w:pPr>
-              <w:spacing w:after="60"/>
-            </w:pPr>
-            <w:r>
-              <w:rPr>
-                <w:rFonts w:ascii="Calibri" w:eastAsia="Calibri" w:hAnsi="Calibri" w:cs="Calibri"/>
-                <w:b/>
-                <w:bCs/>
-                <w:color w:val="1A2528"/>
-                <w:sz w:val="19"/>
-                <w:szCs w:val="19"/>
-              </w:rPr>
-              <w:t xml:space="preserve">Referencia Interna: {ref_interna}</w:t>
-            </w:r>
-          </w:p>
-        </w:tc>
-        <w:tc>
-          <w:tcPr>
-            <w:tcW w:w="6050" w:type="dxa"/>
-            <w:tcMar>
-              <w:top w:w="100" w:type="dxa"/>
-              <w:left w:w="120" w:type="dxa"/>
-              <w:bottom w:w="100" w:type="dxa"/>
-              <w:right w:w="120" w:type="dxa"/>
-            </w:tcMar>
-          </w:tcPr>
-          <w:p>
-            <w:pPr>
-              <w:spacing w:after="60"/>
-            </w:pPr>
-          </w:p>
-        </w:tc>
-      </w:tr>
-      <w:tr>
-        <w:tc>
-          <w:tcPr>
-            <w:tcW w:w="3020" w:type="dxa"/>
-            <w:shd w:val="clear" w:color="auto" w:fill="F2EFEB"/>
-            <w:tcMar>
-              <w:top w:w="100" w:type="dxa"/>
-              <w:left w:w="120" w:type="dxa"/>
-              <w:bottom w:w="100" w:type="dxa"/>
-              <w:right w:w="120" w:type="dxa"/>
-            </w:tcMar>
-          </w:tcPr>
-          <w:p>
-            <w:pPr>
-              <w:spacing w:after="60"/>
-            </w:pPr>
-            <w:r>
-              <w:rPr>
-                <w:rFonts w:ascii="Calibri" w:eastAsia="Calibri" w:hAnsi="Calibri" w:cs="Calibri"/>
-                <w:b/>
-                <w:bCs/>
-                <w:color w:val="1A2528"/>
-                <w:sz w:val="19"/>
-                <w:szCs w:val="19"/>
-              </w:rPr>
-              <w:t xml:space="preserve">Precio publicación: {precio_publicacion}</w:t>
-            </w:r>
-          </w:p>
-        </w:tc>
-        <w:tc>
-          <w:tcPr>
-            <w:tcW w:w="6050" w:type="dxa"/>
-            <w:tcMar>
-              <w:top w:w="100" w:type="dxa"/>
-              <w:left w:w="120" w:type="dxa"/>
-              <w:bottom w:w="100" w:type="dxa"/>
-              <w:right w:w="120" w:type="dxa"/>
-            </w:tcMar>
-          </w:tcPr>
-          <w:p>
-            <w:pPr>
-              <w:spacing w:after="60"/>
-            </w:pPr>
-          </w:p>
-        </w:tc>
-      </w:tr>
-    </w:tbl>
+    <w:p>
+      <w:r>
+        <w:rPr>
+          <w:rFonts w:ascii="Calibri" w:eastAsia="Calibri" w:hAnsi="Calibri" w:cs="Calibri"/>
+          <w:b/>
+          <w:bCs/>
+          <w:color w:val="1A2528"/>
+          <w:sz w:val="19"/>
+          <w:szCs w:val="19"/>
+        </w:rPr>
+        <w:t>Dirección: {direccion}</w:t>
+      </w:r>
+    </w:p>
+    <w:p>
+      <w:r>
+        <w:rPr>
+          <w:rFonts w:ascii="Calibri" w:eastAsia="Calibri" w:hAnsi="Calibri" w:cs="Calibri"/>
+          <w:b/>
+          <w:bCs/>
+          <w:color w:val="1A2528"/>
+          <w:sz w:val="19"/>
+          <w:szCs w:val="19"/>
+        </w:rPr>
+        <w:t xml:space="preserve">Referencia catastral: {ref_catastral}</w:t>
+      </w:r>
+    </w:p>
+    <w:p>
+      <w:r>
+        <w:rPr>
+          <w:rFonts w:ascii="Calibri" w:eastAsia="Calibri" w:hAnsi="Calibri" w:cs="Calibri"/>
+          <w:b/>
+          <w:bCs/>
+          <w:color w:val="1A2528"/>
+          <w:sz w:val="19"/>
+          <w:szCs w:val="19"/>
+        </w:rPr>
+        <w:t xml:space="preserve">Referencia Interna: {ref_interna}</w:t>
+      </w:r>
+    </w:p>
+    <w:p>
+      <w:r>
+        <w:rPr>
+          <w:rFonts w:ascii="Calibri" w:eastAsia="Calibri" w:hAnsi="Calibri" w:cs="Calibri"/>
+          <w:b/>
+          <w:bCs/>
+          <w:color w:val="1A2528"/>
+          <w:sz w:val="19"/>
+          <w:szCs w:val="19"/>
+        </w:rPr>
+        <w:t xml:space="preserve">Precio publicación: {precio_publicacion}</w:t>
+      </w:r>
+    </w:p>
     <w:p>
       <w:pPr>
         <w:spacing w:after="120"/>
@@ -335,293 +173,76 @@
         <w:t xml:space="preserve">DATOS DEL INTERESADO (COMPRADOR POTENCIAL)</w:t>
       </w:r>
     </w:p>
-    <w:tbl>
-      <w:tblPr>
-        <w:tblW w:w="9070" w:type="dxa"/>
-        <w:tblBorders>
-          <w:top w:val="single" w:sz="4" w:space="0" w:color="auto"/>
-          <w:left w:val="single" w:sz="4" w:space="0" w:color="auto"/>
-          <w:bottom w:val="single" w:sz="4" w:space="0" w:color="auto"/>
-          <w:right w:val="single" w:sz="4" w:space="0" w:color="auto"/>
-          <w:insideH w:val="single" w:sz="4" w:space="0" w:color="auto"/>
-          <w:insideV w:val="single" w:sz="4" w:space="0" w:color="auto"/>
-        </w:tblBorders>
-        <w:tblCellMar>
-          <w:left w:w="10" w:type="dxa"/>
-          <w:right w:w="10" w:type="dxa"/>
-        </w:tblCellMar>
-        <w:tblLook w:val="04A0" w:firstRow="1" w:lastRow="0" w:firstColumn="1" w:lastColumn="0" w:noHBand="0" w:noVBand="1"/>
-      </w:tblPr>
-      <w:tblGrid>
-        <w:gridCol w:w="3020"/>
-        <w:gridCol w:w="6050"/>
-      </w:tblGrid>
-      <w:tr>
-        <w:tc>
-          <w:tcPr>
-            <w:tcW w:w="3020" w:type="dxa"/>
-            <w:shd w:val="clear" w:color="auto" w:fill="F2EFEB"/>
-            <w:tcMar>
-              <w:top w:w="100" w:type="dxa"/>
-              <w:left w:w="120" w:type="dxa"/>
-              <w:bottom w:w="100" w:type="dxa"/>
-              <w:right w:w="120" w:type="dxa"/>
-            </w:tcMar>
-          </w:tcPr>
-          <w:p>
-            <w:pPr>
-              <w:spacing w:after="60"/>
-            </w:pPr>
-            <w:r>
-              <w:rPr>
-                <w:rFonts w:ascii="Calibri" w:eastAsia="Calibri" w:hAnsi="Calibri" w:cs="Calibri"/>
-                <w:b/>
-                <w:bCs/>
-                <w:color w:val="1A2528"/>
-                <w:sz w:val="19"/>
-                <w:szCs w:val="19"/>
-              </w:rPr>
-              <w:t xml:space="preserve">Nombre y Apellidos: {nombre_comprador_2} {nombre_comprador_1}</w:t>
-            </w:r>
-          </w:p>
-        </w:tc>
-        <w:tc>
-          <w:tcPr>
-            <w:tcW w:w="6050" w:type="dxa"/>
-            <w:tcMar>
-              <w:top w:w="100" w:type="dxa"/>
-              <w:left w:w="120" w:type="dxa"/>
-              <w:bottom w:w="100" w:type="dxa"/>
-              <w:right w:w="120" w:type="dxa"/>
-            </w:tcMar>
-          </w:tcPr>
-          <w:p>
-            <w:pPr>
-              <w:spacing w:after="60"/>
-            </w:pPr>
-          </w:p>
-        </w:tc>
-      </w:tr>
-      <w:tr>
-        <w:tc>
-          <w:tcPr>
-            <w:tcW w:w="3020" w:type="dxa"/>
-            <w:shd w:val="clear" w:color="auto" w:fill="F2EFEB"/>
-            <w:tcMar>
-              <w:top w:w="100" w:type="dxa"/>
-              <w:left w:w="120" w:type="dxa"/>
-              <w:bottom w:w="100" w:type="dxa"/>
-              <w:right w:w="120" w:type="dxa"/>
-            </w:tcMar>
-          </w:tcPr>
-          <w:p>
-            <w:pPr>
-              <w:spacing w:after="60"/>
-            </w:pPr>
-            <w:r>
-              <w:rPr>
-                <w:rFonts w:ascii="Calibri" w:eastAsia="Calibri" w:hAnsi="Calibri" w:cs="Calibri"/>
-                <w:b/>
-                <w:bCs/>
-                <w:color w:val="1A2528"/>
-                <w:sz w:val="19"/>
-                <w:szCs w:val="19"/>
-              </w:rPr>
-              <w:t>DNI/NIE: {dni_comprador_2} {dni_comprador_1}</w:t>
-            </w:r>
-          </w:p>
-        </w:tc>
-        <w:tc>
-          <w:tcPr>
-            <w:tcW w:w="6050" w:type="dxa"/>
-            <w:tcMar>
-              <w:top w:w="100" w:type="dxa"/>
-              <w:left w:w="120" w:type="dxa"/>
-              <w:bottom w:w="100" w:type="dxa"/>
-              <w:right w:w="120" w:type="dxa"/>
-            </w:tcMar>
-          </w:tcPr>
-          <w:p>
-            <w:pPr>
-              <w:spacing w:after="60"/>
-            </w:pPr>
-          </w:p>
-        </w:tc>
-      </w:tr>
-      <w:tr>
-        <w:tc>
-          <w:tcPr>
-            <w:tcW w:w="3020" w:type="dxa"/>
-            <w:shd w:val="clear" w:color="auto" w:fill="F2EFEB"/>
-            <w:tcMar>
-              <w:top w:w="100" w:type="dxa"/>
-              <w:left w:w="120" w:type="dxa"/>
-              <w:bottom w:w="100" w:type="dxa"/>
-              <w:right w:w="120" w:type="dxa"/>
-            </w:tcMar>
-          </w:tcPr>
-          <w:p>
-            <w:pPr>
-              <w:spacing w:after="60"/>
-              <w:rPr>
-                <w:rFonts w:ascii="Calibri" w:eastAsia="Calibri" w:hAnsi="Calibri" w:cs="Calibri"/>
-                <w:b/>
-                <w:bCs/>
-                <w:color w:val="1A2528"/>
-                <w:sz w:val="19"/>
-                <w:szCs w:val="19"/>
-              </w:rPr>
-            </w:pPr>
-            <w:r>
-              <w:rPr>
-                <w:rFonts w:ascii="Calibri" w:eastAsia="Calibri" w:hAnsi="Calibri" w:cs="Calibri"/>
-                <w:b/>
-                <w:bCs/>
-                <w:color w:val="1A2528"/>
-                <w:sz w:val="19"/>
-                <w:szCs w:val="19"/>
-              </w:rPr>
-              <w:t>Teléfono: {telefono_comprador_1}</w:t>
-            </w:r>
-          </w:p>
-        </w:tc>
-        <w:tc>
-          <w:tcPr>
-            <w:tcW w:w="6050" w:type="dxa"/>
-            <w:tcMar>
-              <w:top w:w="100" w:type="dxa"/>
-              <w:left w:w="120" w:type="dxa"/>
-              <w:bottom w:w="100" w:type="dxa"/>
-              <w:right w:w="120" w:type="dxa"/>
-            </w:tcMar>
-          </w:tcPr>
-          <w:p>
-            <w:pPr>
-              <w:spacing w:after="60"/>
-            </w:pPr>
-          </w:p>
-        </w:tc>
-      </w:tr>
-    </w:tbl>
+    <w:p>
+      <w:r>
+        <w:rPr>
+          <w:rFonts w:ascii="Calibri" w:eastAsia="Calibri" w:hAnsi="Calibri" w:cs="Calibri"/>
+          <w:b/>
+          <w:bCs/>
+          <w:color w:val="1A2528"/>
+          <w:sz w:val="19"/>
+          <w:szCs w:val="19"/>
+        </w:rPr>
+        <w:t xml:space="preserve">Nombre y Apellidos: {nombre_comprador_2} {nombre_comprador_1}</w:t>
+      </w:r>
+    </w:p>
+    <w:p>
+      <w:r>
+        <w:rPr>
+          <w:rFonts w:ascii="Calibri" w:eastAsia="Calibri" w:hAnsi="Calibri" w:cs="Calibri"/>
+          <w:b/>
+          <w:bCs/>
+          <w:color w:val="1A2528"/>
+          <w:sz w:val="19"/>
+          <w:szCs w:val="19"/>
+        </w:rPr>
+        <w:t>DNI/NIE: {dni_comprador_2} {dni_comprador_1}</w:t>
+      </w:r>
+    </w:p>
+    <w:p>
+      <w:r>
+        <w:rPr>
+          <w:rFonts w:ascii="Calibri" w:eastAsia="Calibri" w:hAnsi="Calibri" w:cs="Calibri"/>
+          <w:b/>
+          <w:bCs/>
+          <w:color w:val="1A2528"/>
+          <w:sz w:val="19"/>
+          <w:szCs w:val="19"/>
+        </w:rPr>
+        <w:t>Teléfono: {telefono_comprador_1}</w:t>
+      </w:r>
+    </w:p>
     <w:p>
       <w:pPr>
         <w:spacing w:after="120"/>
       </w:pPr>
     </w:p>
-    <w:tbl>
-      <w:tblPr>
-        <w:tblW w:w="9070" w:type="dxa"/>
-        <w:tblBorders>
-          <w:top w:val="single" w:sz="4" w:space="0" w:color="auto"/>
-          <w:left w:val="single" w:sz="4" w:space="0" w:color="auto"/>
-          <w:bottom w:val="single" w:sz="4" w:space="0" w:color="auto"/>
-          <w:right w:val="single" w:sz="4" w:space="0" w:color="auto"/>
-          <w:insideH w:val="single" w:sz="4" w:space="0" w:color="auto"/>
-          <w:insideV w:val="single" w:sz="4" w:space="0" w:color="auto"/>
-        </w:tblBorders>
-        <w:tblCellMar>
-          <w:left w:w="10" w:type="dxa"/>
-          <w:right w:w="10" w:type="dxa"/>
-        </w:tblCellMar>
-        <w:tblLook w:val="04A0" w:firstRow="1" w:lastRow="0" w:firstColumn="1" w:lastColumn="0" w:noHBand="0" w:noVBand="1"/>
-      </w:tblPr>
-      <w:tblGrid>
-        <w:gridCol w:w="3020"/>
-        <w:gridCol w:w="6050"/>
-      </w:tblGrid>
-      <w:tr>
-        <w:tc>
-          <w:tcPr>
-            <w:tcW w:w="3020" w:type="dxa"/>
-            <w:shd w:val="clear" w:color="auto" w:fill="F2EFEB"/>
-            <w:tcMar>
-              <w:top w:w="100" w:type="dxa"/>
-              <w:left w:w="120" w:type="dxa"/>
-              <w:bottom w:w="100" w:type="dxa"/>
-              <w:right w:w="120" w:type="dxa"/>
-            </w:tcMar>
-          </w:tcPr>
-          <w:p>
-            <w:pPr>
-              <w:spacing w:after="60"/>
-            </w:pPr>
-            <w:r>
-              <w:rPr>
-                <w:rFonts w:ascii="Calibri" w:eastAsia="Calibri" w:hAnsi="Calibri" w:cs="Calibri"/>
-                <w:b/>
-                <w:bCs/>
-                <w:color w:val="1A2528"/>
-                <w:sz w:val="19"/>
-                <w:szCs w:val="19"/>
-              </w:rPr>
-              <w:t xml:space="preserve">Nombre y Apellidos:</w:t>
-            </w:r>
-          </w:p>
-        </w:tc>
-        <w:tc>
-          <w:tcPr>
-            <w:tcW w:w="6050" w:type="dxa"/>
-            <w:tcMar>
-              <w:top w:w="100" w:type="dxa"/>
-              <w:left w:w="120" w:type="dxa"/>
-              <w:bottom w:w="100" w:type="dxa"/>
-              <w:right w:w="120" w:type="dxa"/>
-            </w:tcMar>
-          </w:tcPr>
-          <w:p>
-            <w:pPr>
-              <w:spacing w:after="60"/>
-            </w:pPr>
-          </w:p>
-        </w:tc>
-      </w:tr>
-      <w:tr>
-        <w:tc>
-          <w:tcPr>
-            <w:tcW w:w="3020" w:type="dxa"/>
-            <w:shd w:val="clear" w:color="auto" w:fill="F2EFEB"/>
-            <w:tcMar>
-              <w:top w:w="100" w:type="dxa"/>
-              <w:left w:w="120" w:type="dxa"/>
-              <w:bottom w:w="100" w:type="dxa"/>
-              <w:right w:w="120" w:type="dxa"/>
-            </w:tcMar>
-          </w:tcPr>
-          <w:p>
-            <w:pPr>
-              <w:spacing w:after="60"/>
-            </w:pPr>
-            <w:r>
-              <w:rPr>
-                <w:rFonts w:ascii="Calibri" w:eastAsia="Calibri" w:hAnsi="Calibri" w:cs="Calibri"/>
-                <w:b/>
-                <w:bCs/>
-                <w:color w:val="1A2528"/>
-                <w:sz w:val="19"/>
-                <w:szCs w:val="19"/>
-              </w:rPr>
-              <w:t>DNI/NIE:</w:t>
-            </w:r>
-          </w:p>
-        </w:tc>
-        <w:tc>
-          <w:tcPr>
-            <w:tcW w:w="6050" w:type="dxa"/>
-            <w:tcMar>
-              <w:top w:w="100" w:type="dxa"/>
-              <w:left w:w="120" w:type="dxa"/>
-              <w:bottom w:w="100" w:type="dxa"/>
-              <w:right w:w="120" w:type="dxa"/>
-            </w:tcMar>
-          </w:tcPr>
-          <w:p>
-            <w:pPr>
-              <w:spacing w:after="60"/>
-            </w:pPr>
-          </w:p>
-        </w:tc>
-      </w:tr>
-    </w:tbl>
+    <w:p>
+      <w:r>
+        <w:rPr>
+          <w:rFonts w:ascii="Calibri" w:eastAsia="Calibri" w:hAnsi="Calibri" w:cs="Calibri"/>
+          <w:b/>
+          <w:bCs/>
+          <w:color w:val="1A2528"/>
+          <w:sz w:val="19"/>
+          <w:szCs w:val="19"/>
+        </w:rPr>
+        <w:t xml:space="preserve">Nombre y Apellidos:</w:t>
+      </w:r>
+    </w:p>
+    <w:p>
+      <w:r>
+        <w:rPr>
+          <w:rFonts w:ascii="Calibri" w:eastAsia="Calibri" w:hAnsi="Calibri" w:cs="Calibri"/>
+          <w:b/>
+          <w:bCs/>
+          <w:color w:val="1A2528"/>
+          <w:sz w:val="19"/>
+          <w:szCs w:val="19"/>
+        </w:rPr>
+        <w:t>DNI/NIE:</w:t>
+      </w:r>
+    </w:p>
     <w:p>
       <w:pPr>
         <w:spacing w:after="120"/>
@@ -708,188 +329,19 @@
         <w:t xml:space="preserve">FIRMAS DE CONFORMIDAD</w:t>
       </w:r>
     </w:p>
-    <w:tbl>
-      <w:tblPr>
-        <w:tblW w:w="9070" w:type="dxa"/>
-        <w:tblBorders>
-          <w:top w:val="single" w:sz="4" w:space="0" w:color="auto"/>
-          <w:left w:val="single" w:sz="4" w:space="0" w:color="auto"/>
-          <w:bottom w:val="single" w:sz="4" w:space="0" w:color="auto"/>
-          <w:right w:val="single" w:sz="4" w:space="0" w:color="auto"/>
-          <w:insideH w:val="single" w:sz="4" w:space="0" w:color="auto"/>
-          <w:insideV w:val="single" w:sz="4" w:space="0" w:color="auto"/>
-        </w:tblBorders>
-        <w:tblCellMar>
-          <w:left w:w="10" w:type="dxa"/>
-          <w:right w:w="10" w:type="dxa"/>
-        </w:tblCellMar>
-        <w:tblLook w:val="04A0" w:firstRow="1" w:lastRow="0" w:firstColumn="1" w:lastColumn="0" w:noHBand="0" w:noVBand="1"/>
-      </w:tblPr>
-      <w:tblGrid>
-        <w:gridCol w:w="4535"/>
-        <w:gridCol w:w="4535"/>
-      </w:tblGrid>
-      <w:tr>
-        <w:tc>
-          <w:tcPr>
-            <w:tcW w:w="4535" w:type="dxa"/>
-            <w:shd w:val="clear" w:color="auto" w:fill="F2EFEB"/>
-            <w:tcMar>
-              <w:top w:w="100" w:type="dxa"/>
-              <w:left w:w="120" w:type="dxa"/>
-              <w:bottom w:w="100" w:type="dxa"/>
-              <w:right w:w="120" w:type="dxa"/>
-            </w:tcMar>
-          </w:tcPr>
-          <w:p>
-            <w:pPr>
-              <w:spacing w:after="60"/>
-            </w:pPr>
-            <w:r>
-              <w:rPr>
-                <w:rFonts w:ascii="Calibri" w:eastAsia="Calibri" w:hAnsi="Calibri" w:cs="Calibri"/>
-                <w:b/>
-                <w:bCs/>
-                <w:color w:val="1A2528"/>
-                <w:sz w:val="19"/>
-                <w:szCs w:val="19"/>
-              </w:rPr>
-              <w:t xml:space="preserve">Firma del Interesado</w:t>
-            </w:r>
-          </w:p>
-        </w:tc>
-        <w:tc>
-          <w:tcPr>
-            <w:tcW w:w="4535" w:type="dxa"/>
-            <w:shd w:val="clear" w:color="auto" w:fill="F2EFEB"/>
-            <w:tcMar>
-              <w:top w:w="100" w:type="dxa"/>
-              <w:left w:w="120" w:type="dxa"/>
-              <w:bottom w:w="100" w:type="dxa"/>
-              <w:right w:w="120" w:type="dxa"/>
-            </w:tcMar>
-          </w:tcPr>
-          <w:p>
-            <w:pPr>
-              <w:spacing w:after="60"/>
-            </w:pPr>
-            <w:r>
-              <w:rPr>
-                <w:rFonts w:ascii="Calibri" w:eastAsia="Calibri" w:hAnsi="Calibri" w:cs="Calibri"/>
-                <w:b/>
-                <w:bCs/>
-                <w:color w:val="1A2528"/>
-                <w:sz w:val="19"/>
-                <w:szCs w:val="19"/>
-              </w:rPr>
-              <w:t xml:space="preserve">Firma del Agente</w:t>
-            </w:r>
-          </w:p>
-        </w:tc>
-      </w:tr>
-      <w:tr>
-        <w:tc>
-          <w:tcPr>
-            <w:tcW w:w="4535" w:type="dxa"/>
-            <w:tcMar>
-              <w:top w:w="100" w:type="dxa"/>
-              <w:left w:w="120" w:type="dxa"/>
-              <w:bottom w:w="100" w:type="dxa"/>
-              <w:right w:w="120" w:type="dxa"/>
-            </w:tcMar>
-          </w:tcPr>
-          <w:p>
-            <w:pPr>
-              <w:spacing w:after="60"/>
-            </w:pPr>
-          </w:p>
-        </w:tc>
-        <w:tc>
-          <w:tcPr>
-            <w:tcW w:w="4535" w:type="dxa"/>
-            <w:tcMar>
-              <w:top w:w="100" w:type="dxa"/>
-              <w:left w:w="120" w:type="dxa"/>
-              <w:bottom w:w="100" w:type="dxa"/>
-              <w:right w:w="120" w:type="dxa"/>
-            </w:tcMar>
-          </w:tcPr>
-          <w:p>
-            <w:pPr>
-              <w:spacing w:after="60"/>
-            </w:pPr>
-          </w:p>
-        </w:tc>
-      </w:tr>
-      <w:tr>
-        <w:tc>
-          <w:tcPr>
-            <w:tcW w:w="4535" w:type="dxa"/>
-            <w:tcMar>
-              <w:top w:w="100" w:type="dxa"/>
-              <w:left w:w="120" w:type="dxa"/>
-              <w:bottom w:w="100" w:type="dxa"/>
-              <w:right w:w="120" w:type="dxa"/>
-            </w:tcMar>
-          </w:tcPr>
-          <w:p>
-            <w:pPr>
-              <w:spacing w:after="60"/>
-            </w:pPr>
-          </w:p>
-        </w:tc>
-        <w:tc>
-          <w:tcPr>
-            <w:tcW w:w="4535" w:type="dxa"/>
-            <w:tcMar>
-              <w:top w:w="100" w:type="dxa"/>
-              <w:left w:w="120" w:type="dxa"/>
-              <w:bottom w:w="100" w:type="dxa"/>
-              <w:right w:w="120" w:type="dxa"/>
-            </w:tcMar>
-          </w:tcPr>
-          <w:p>
-            <w:pPr>
-              <w:spacing w:after="60"/>
-            </w:pPr>
-          </w:p>
-        </w:tc>
-      </w:tr>
-      <w:tr>
-        <w:tc>
-          <w:tcPr>
-            <w:tcW w:w="4535" w:type="dxa"/>
-            <w:tcMar>
-              <w:top w:w="100" w:type="dxa"/>
-              <w:left w:w="120" w:type="dxa"/>
-              <w:bottom w:w="100" w:type="dxa"/>
-              <w:right w:w="120" w:type="dxa"/>
-            </w:tcMar>
-          </w:tcPr>
-          <w:p>
-            <w:pPr>
-              <w:spacing w:after="60"/>
-            </w:pPr>
-          </w:p>
-        </w:tc>
-        <w:tc>
-          <w:tcPr>
-            <w:tcW w:w="4535" w:type="dxa"/>
-            <w:tcMar>
-              <w:top w:w="100" w:type="dxa"/>
-              <w:left w:w="120" w:type="dxa"/>
-              <w:bottom w:w="100" w:type="dxa"/>
-              <w:right w:w="120" w:type="dxa"/>
-            </w:tcMar>
-          </w:tcPr>
-          <w:p>
-            <w:pPr>
-              <w:spacing w:after="60"/>
-            </w:pPr>
-          </w:p>
-        </w:tc>
-      </w:tr>
-    </w:tbl>
+    <w:p>
+      <w:r>
+        <w:rPr>
+          <w:rFonts w:ascii="Calibri" w:eastAsia="Calibri" w:hAnsi="Calibri" w:cs="Calibri"/>
+          <w:b/>
+          <w:bCs/>
+          <w:color w:val="1A2528"/>
+          <w:sz w:val="19"/>
+          <w:szCs w:val="19"/>
+        </w:rPr>
+        <w:t xml:space="preserve">Firma del Interesado Firma del Agente</w:t>
+      </w:r>
+    </w:p>
     <w:p>
       <w:pPr>
         <w:spacing w:after="120"/>

</xml_diff>

<commit_message>
fix: documentos visita — DNI y póliza RC del agente, dirección completa con número y tipo, query ampliada
</commit_message>
<xml_diff>
--- a/public/plantillas/1_Registro_Cliente_Hoja_Visita.docx
+++ b/public/plantillas/1_Registro_Cliente_Hoja_Visita.docx
@@ -77,53 +77,21 @@
     </w:p>
     <w:p>
       <w:r>
-        <w:rPr>
-          <w:rFonts w:ascii="Calibri" w:eastAsia="Calibri" w:hAnsi="Calibri" w:cs="Calibri"/>
-          <w:b/>
-          <w:bCs/>
-          <w:color w:val="1A2528"/>
-          <w:sz w:val="19"/>
-          <w:szCs w:val="19"/>
-        </w:rPr>
         <w:t>Dirección: {direccion}</w:t>
       </w:r>
     </w:p>
     <w:p>
       <w:r>
-        <w:rPr>
-          <w:rFonts w:ascii="Calibri" w:eastAsia="Calibri" w:hAnsi="Calibri" w:cs="Calibri"/>
-          <w:b/>
-          <w:bCs/>
-          <w:color w:val="1A2528"/>
-          <w:sz w:val="19"/>
-          <w:szCs w:val="19"/>
-        </w:rPr>
         <w:t xml:space="preserve">Referencia catastral: {ref_catastral}</w:t>
       </w:r>
     </w:p>
     <w:p>
       <w:r>
-        <w:rPr>
-          <w:rFonts w:ascii="Calibri" w:eastAsia="Calibri" w:hAnsi="Calibri" w:cs="Calibri"/>
-          <w:b/>
-          <w:bCs/>
-          <w:color w:val="1A2528"/>
-          <w:sz w:val="19"/>
-          <w:szCs w:val="19"/>
-        </w:rPr>
         <w:t xml:space="preserve">Referencia Interna: {ref_interna}</w:t>
       </w:r>
     </w:p>
     <w:p>
       <w:r>
-        <w:rPr>
-          <w:rFonts w:ascii="Calibri" w:eastAsia="Calibri" w:hAnsi="Calibri" w:cs="Calibri"/>
-          <w:b/>
-          <w:bCs/>
-          <w:color w:val="1A2528"/>
-          <w:sz w:val="19"/>
-          <w:szCs w:val="19"/>
-        </w:rPr>
         <w:t xml:space="preserve">Precio publicación: {precio_publicacion}</w:t>
       </w:r>
     </w:p>
@@ -156,7 +124,7 @@
           <w:rFonts w:ascii="Garamond" w:eastAsia="Garamond" w:hAnsi="Garamond" w:cs="Garamond"/>
           <w:color w:val="1A2528"/>
         </w:rPr>
-        <w:t xml:space="preserve">D./Dña. {nombre_agente}, actuando como Agente Independiente en Colaboración con Nativa Properties (Mallorca Nativa, S.L., CIF B75396234), ha acompañado y asesorado al interesado en la visita al inmueble anteriormente descrito.</w:t>
+        <w:t xml:space="preserve">D./Dña. {nombre_agente}, con DNI/NIE {dni_agente} y Nº Póliza RC {poliza_rc_agente}, actuando como Agente Independiente en Colaboración con Nativa Properties (Mallorca Nativa, S.L., CIF B75396234), ha acompañado y asesorado al interesado en la visita al inmueble anteriormente descrito.</w:t>
       </w:r>
     </w:p>
     <w:p>
@@ -175,40 +143,16 @@
     </w:p>
     <w:p>
       <w:r>
-        <w:rPr>
-          <w:rFonts w:ascii="Calibri" w:eastAsia="Calibri" w:hAnsi="Calibri" w:cs="Calibri"/>
-          <w:b/>
-          <w:bCs/>
-          <w:color w:val="1A2528"/>
-          <w:sz w:val="19"/>
-          <w:szCs w:val="19"/>
-        </w:rPr>
         <w:t xml:space="preserve">Nombre y Apellidos: {nombre_comprador_2} {nombre_comprador_1}</w:t>
       </w:r>
     </w:p>
     <w:p>
       <w:r>
-        <w:rPr>
-          <w:rFonts w:ascii="Calibri" w:eastAsia="Calibri" w:hAnsi="Calibri" w:cs="Calibri"/>
-          <w:b/>
-          <w:bCs/>
-          <w:color w:val="1A2528"/>
-          <w:sz w:val="19"/>
-          <w:szCs w:val="19"/>
-        </w:rPr>
         <w:t>DNI/NIE: {dni_comprador_2} {dni_comprador_1}</w:t>
       </w:r>
     </w:p>
     <w:p>
       <w:r>
-        <w:rPr>
-          <w:rFonts w:ascii="Calibri" w:eastAsia="Calibri" w:hAnsi="Calibri" w:cs="Calibri"/>
-          <w:b/>
-          <w:bCs/>
-          <w:color w:val="1A2528"/>
-          <w:sz w:val="19"/>
-          <w:szCs w:val="19"/>
-        </w:rPr>
         <w:t>Teléfono: {telefono_comprador_1}</w:t>
       </w:r>
     </w:p>
@@ -219,27 +163,11 @@
     </w:p>
     <w:p>
       <w:r>
-        <w:rPr>
-          <w:rFonts w:ascii="Calibri" w:eastAsia="Calibri" w:hAnsi="Calibri" w:cs="Calibri"/>
-          <w:b/>
-          <w:bCs/>
-          <w:color w:val="1A2528"/>
-          <w:sz w:val="19"/>
-          <w:szCs w:val="19"/>
-        </w:rPr>
         <w:t xml:space="preserve">Nombre y Apellidos:</w:t>
       </w:r>
     </w:p>
     <w:p>
       <w:r>
-        <w:rPr>
-          <w:rFonts w:ascii="Calibri" w:eastAsia="Calibri" w:hAnsi="Calibri" w:cs="Calibri"/>
-          <w:b/>
-          <w:bCs/>
-          <w:color w:val="1A2528"/>
-          <w:sz w:val="19"/>
-          <w:szCs w:val="19"/>
-        </w:rPr>
         <w:t>DNI/NIE:</w:t>
       </w:r>
     </w:p>
@@ -331,14 +259,6 @@
     </w:p>
     <w:p>
       <w:r>
-        <w:rPr>
-          <w:rFonts w:ascii="Calibri" w:eastAsia="Calibri" w:hAnsi="Calibri" w:cs="Calibri"/>
-          <w:b/>
-          <w:bCs/>
-          <w:color w:val="1A2528"/>
-          <w:sz w:val="19"/>
-          <w:szCs w:val="19"/>
-        </w:rPr>
         <w:t xml:space="preserve">Firma del Interesado Firma del Agente</w:t>
       </w:r>
     </w:p>

</xml_diff>